<commit_message>
fix: make DJ residency terms variable
</commit_message>
<xml_diff>
--- a/static/djResidency_updated.docx
+++ b/static/djResidency_updated.docx
@@ -2662,7 +2662,7 @@
           <w:vertAlign w:val="baseline"/>
           <w:rtl w:val="0"/>
         </w:rPr>
-        <w:t xml:space="preserve">Each performance shall last {{performanceHours}} ({{performanceHoursNumber}}) hours, split into {{numberOfSets}} ({{numberOfSetsNumber}}) sets. In case the Venue is reserved for any private event during weekends within the term of this Agreement, Party A shall provide the Service on specific dates instead which shall be agreed by the Parties upon before the start of each month or the Venue is booked as noticed by Party B. </w:t>
+        <w:t xml:space="preserve">Each performance shall consist of {{numberOfSets}} ({{numberOfSetsNumber}}) sets, with the duration of each set agreed by the Parties for each performance. In case the Venue is reserved for any private event during weekends within the term of this Agreement, Party A shall provide the Service on specific dates instead which shall be agreed by the Parties upon before the start of each month or the Venue is booked as noticed by Party B. </w:t>
       </w:r>
     </w:p>
     <w:p>
@@ -2845,7 +2845,7 @@
           <w:vertAlign w:val="baseline"/>
           <w:rtl w:val="0"/>
         </w:rPr>
-        <w:t xml:space="preserve">Mỗi buổi biểu diễn kéo dài {{performanceHoursVietnamese}} ({{performanceHoursNumber}}) giờ, chia thành {{numberOfSetsVietnamese}} ({{numberOfSetsNumber}}) phần. Trường hợp  Địa Điểm Biểu Diễn được bao đặt cho các sự kiện riêng vào bất kỳ ngày cuối tuần nào trong suốt thời hạn của Hợp Đồng này, thì Bên A sẽ phải cung cấp Dịch Vụ bù vào ngày cụ thể khác được các Bên thống nhất trước khi bắt đầu mỗi tháng hoặc ngay khi Địa Điểm Biều Diễn được bao đặt theo thông báo của Bên B. </w:t>
+        <w:t xml:space="preserve">Mỗi buổi biểu diễn gồm {{numberOfSetsVietnamese}} ({{numberOfSetsNumber}}) phần, với thời lượng của từng phần do các Bên thỏa thuận cho từng buổi biểu diễn. Trường hợp  Địa Điểm Biểu Diễn được bao đặt cho các sự kiện riêng vào bất kỳ ngày cuối tuần nào trong suốt thời hạn của Hợp Đồng này, thì Bên A sẽ phải cung cấp Dịch Vụ bù vào ngày cụ thể khác được các Bên thống nhất trước khi bắt đầu mỗi tháng hoặc ngay khi Địa Điểm Biều Diễn được bao đặt theo thông báo của Bên B. </w:t>
       </w:r>
     </w:p>
     <w:p>
@@ -3121,9 +3121,9 @@
           <w:vertAlign w:val="baseline"/>
           <w:rtl w:val="0"/>
         </w:rPr>
-        <w:t xml:space="preserve">The remuneration for each performance slot ({{performanceHoursNumber}} hours) is {{performanceFeeVND}} ({{performanceFeeInWords}}), excluding VAT.</w:t>
+        <w:t xml:space="preserve">The remuneration for each hour of performance is {{performanceFeeVND}} ({{performanceFeeInWords}}), excluding VAT.</w:t>
         <w:br w:type="textWrapping"/>
-        <w:t xml:space="preserve">Mức thù lao cho mỗi suất biểu diễn ({{performanceHoursNumber}} giờ) là {{performanceFeeVND}} ({{performanceFeeInWordsVietnamese}}), chưa bao gồm thuế GTGT.</w:t>
+        <w:t xml:space="preserve">Mức thù lao cho mỗi giờ biểu diễn là {{performanceFeeVND}} ({{performanceFeeInWordsVietnamese}}), chưa bao gồm thuế GTGT.</w:t>
       </w:r>
     </w:p>
     <w:p>

</xml_diff>